<commit_message>
Refactor harutils taxonomy and candidate selection
</commit_message>
<xml_diff>
--- a/examples/anomalies/doc/16-regression-ml-hanr_ml_mlp.docx
+++ b/examples/anomalies/doc/16-regression-ml-hanr_ml_mlp.docx
@@ -542,7 +542,13 @@
         <w:rPr>
           <w:rStyle w:val="NormalTok"/>
         </w:rPr>
-        <w:t xml:space="preserve">(</w:t>
+        <w:t xml:space="preserve">(tspredit</w:t>
+      </w:r>
+      <w:r>
+        <w:rPr>
+          <w:rStyle w:val="SpecialCharTok"/>
+        </w:rPr>
+        <w:t xml:space="preserve">::</w:t>
       </w:r>
       <w:r>
         <w:rPr>
@@ -554,7 +560,13 @@
         <w:rPr>
           <w:rStyle w:val="NormalTok"/>
         </w:rPr>
-        <w:t xml:space="preserve">(</w:t>
+        <w:t xml:space="preserve">(tspredit</w:t>
+      </w:r>
+      <w:r>
+        <w:rPr>
+          <w:rStyle w:val="SpecialCharTok"/>
+        </w:rPr>
+        <w:t xml:space="preserve">::</w:t>
       </w:r>
       <w:r>
         <w:rPr>

</xml_diff>